<commit_message>
Ingenieria de Software v3 y utulab v2
</commit_message>
<xml_diff>
--- a/Datos/Ingenieria de software/preguntas para Entrevista.docx
+++ b/Datos/Ingenieria de software/preguntas para Entrevista.docx
@@ -93,6 +93,17 @@
         <w:rPr>
           <w:rtl w:val="0"/>
         </w:rPr>
+      </w:r>
+    </w:p>
+    <w:p>
+      <w:pPr>
+        <w:ind w:left="0" w:firstLine="0"/>
+        <w:rPr/>
+      </w:pPr>
+      <w:r>
+        <w:rPr>
+          <w:rtl w:val="0"/>
+        </w:rPr>
         <w:t xml:space="preserve">1) Usuarios</w:t>
       </w:r>
     </w:p>
@@ -104,7 +115,7 @@
         <w:rPr>
           <w:rtl w:val="0"/>
         </w:rPr>
-        <w:t xml:space="preserve">a)¿Qué información adicional deberá incluir el perfil de un proveedor, además de los datos de contacto, habilidades, experiencia? </w:t>
+        <w:t xml:space="preserve">a)¿Qué información adicional deberá incluir el perfil de un proveedor, además de los datos de contacto, habilidades y experiencia? </w:t>
       </w:r>
     </w:p>
     <w:p>
@@ -126,18 +137,29 @@
         <w:rPr>
           <w:rtl w:val="0"/>
         </w:rPr>
-        <w:t xml:space="preserve">c)¿Qué nivel de verificación o seguridad desean implementar en el registro de usuarios? ¿Correo, SMS, captcha?</w:t>
-      </w:r>
-    </w:p>
-    <w:p>
-      <w:pPr>
-        <w:rPr/>
-      </w:pPr>
-      <w:r>
-        <w:rPr>
-          <w:rtl w:val="0"/>
-        </w:rPr>
-        <w:t xml:space="preserve">d)¿Qué funcionalidades específicas deberían tener los distintos roles (cliente, proveedor,</w:t>
+        <w:t xml:space="preserve">c)¿Qué tipo de información no  puede editar en el perfil tanto cliente como proveedor? </w:t>
+      </w:r>
+    </w:p>
+    <w:p>
+      <w:pPr>
+        <w:rPr/>
+      </w:pPr>
+      <w:r>
+        <w:rPr>
+          <w:rtl w:val="0"/>
+        </w:rPr>
+        <w:t xml:space="preserve">d)¿Qué nivel de verificación o seguridad desean implementar en el registro de usuarios? ¿Correo, SMS, captcha?</w:t>
+      </w:r>
+    </w:p>
+    <w:p>
+      <w:pPr>
+        <w:rPr/>
+      </w:pPr>
+      <w:r>
+        <w:rPr>
+          <w:rtl w:val="0"/>
+        </w:rPr>
+        <w:t xml:space="preserve">e)¿Qué funcionalidades específicas deberían tener los distintos roles (cliente, proveedor,</w:t>
       </w:r>
     </w:p>
     <w:p>
@@ -166,7 +188,7 @@
         <w:rPr>
           <w:rtl w:val="0"/>
         </w:rPr>
-        <w:t xml:space="preserve">e</w:t>
+        <w:t xml:space="preserve">f</w:t>
       </w:r>
       <w:r>
         <w:rPr>
@@ -183,7 +205,17 @@
         <w:rPr>
           <w:rtl w:val="0"/>
         </w:rPr>
-        <w:t xml:space="preserve">f)¿Qué información debe ser visible para otros usuarios en el perfil? (por ejemplo, número de teléfono, ubicación, foto, etc.)</w:t>
+        <w:t xml:space="preserve">g)¿Qué información debe ser visible para otros usuarios en el perfil? (por ejemplo, número de teléfono, ubicación, foto, etc.)</w:t>
+      </w:r>
+    </w:p>
+    <w:p>
+      <w:pPr>
+        <w:rPr/>
+      </w:pPr>
+      <w:r>
+        <w:rPr>
+          <w:rtl w:val="0"/>
+        </w:rPr>
       </w:r>
     </w:p>
     <w:p>
@@ -314,6 +346,44 @@
           <w:rtl w:val="0"/>
         </w:rPr>
         <w:t xml:space="preserve">f)¿Quién puede ver las calificaciones? ¿Solo el proveedor, todos los usuarios, solo el cliente?</w:t>
+      </w:r>
+    </w:p>
+    <w:p>
+      <w:pPr>
+        <w:rPr/>
+      </w:pPr>
+      <w:r>
+        <w:rPr>
+          <w:rtl w:val="0"/>
+        </w:rPr>
+      </w:r>
+    </w:p>
+    <w:p>
+      <w:pPr>
+        <w:rPr>
+          <w:color w:val="ff00ff"/>
+        </w:rPr>
+      </w:pPr>
+      <w:r>
+        <w:rPr>
+          <w:color w:val="ff00ff"/>
+          <w:rtl w:val="0"/>
+        </w:rPr>
+        <w:t xml:space="preserve">//sistema de comentarios</w:t>
+      </w:r>
+    </w:p>
+    <w:p>
+      <w:pPr>
+        <w:rPr>
+          <w:color w:val="ff00ff"/>
+        </w:rPr>
+      </w:pPr>
+      <w:r>
+        <w:rPr>
+          <w:color w:val="ff00ff"/>
+          <w:rtl w:val="0"/>
+        </w:rPr>
+        <w:t xml:space="preserve">//notificación dentro de la plataforma</w:t>
       </w:r>
     </w:p>
     <w:p>
@@ -412,26 +482,6 @@
           <w:rtl w:val="0"/>
         </w:rPr>
         <w:t xml:space="preserve">c)¿Desean incluir notificaciones por correo o solo dentro de la plataforma?</w:t>
-      </w:r>
-    </w:p>
-    <w:p>
-      <w:pPr>
-        <w:rPr/>
-      </w:pPr>
-      <w:r>
-        <w:rPr>
-          <w:rtl w:val="0"/>
-        </w:rPr>
-      </w:r>
-    </w:p>
-    <w:p>
-      <w:pPr>
-        <w:rPr/>
-      </w:pPr>
-      <w:r>
-        <w:rPr>
-          <w:rtl w:val="0"/>
-        </w:rPr>
       </w:r>
     </w:p>
     <w:p>
@@ -979,88 +1029,117 @@
         <w:rPr>
           <w:rtl w:val="0"/>
         </w:rPr>
-        <w:t xml:space="preserve">a) proveedor: CI, foto, zona,dirección, título,</w:t>
-      </w:r>
-    </w:p>
-    <w:p>
-      <w:pPr>
-        <w:rPr/>
-      </w:pPr>
-      <w:r>
-        <w:rPr>
-          <w:rtl w:val="0"/>
-        </w:rPr>
-        <w:t xml:space="preserve">               Habilidad, descripción, teléfono</w:t>
-      </w:r>
-    </w:p>
-    <w:p>
-      <w:pPr>
-        <w:ind w:left="720" w:firstLine="0"/>
-        <w:rPr/>
-      </w:pPr>
-      <w:r>
-        <w:rPr>
-          <w:rtl w:val="0"/>
-        </w:rPr>
-        <w:t xml:space="preserve">    </w:t>
-      </w:r>
-    </w:p>
-    <w:p>
-      <w:pPr>
-        <w:ind w:left="720" w:firstLine="0"/>
-        <w:rPr/>
-      </w:pPr>
-      <w:r>
-        <w:rPr>
-          <w:rtl w:val="0"/>
-        </w:rPr>
-        <w:t xml:space="preserve">b) clientes:  nombre, apellido, correo,CI, nacimiento,contraseña</w:t>
-      </w:r>
-    </w:p>
-    <w:p>
-      <w:pPr>
-        <w:ind w:left="720" w:firstLine="0"/>
-        <w:rPr/>
-      </w:pPr>
-      <w:r>
-        <w:rPr>
-          <w:rtl w:val="0"/>
-        </w:rPr>
-      </w:r>
-    </w:p>
-    <w:p>
-      <w:pPr>
-        <w:ind w:left="720" w:firstLine="0"/>
-        <w:rPr/>
-      </w:pPr>
-      <w:r>
-        <w:rPr>
-          <w:rtl w:val="0"/>
-        </w:rPr>
-        <w:t xml:space="preserve">c) captcha</w:t>
-      </w:r>
-    </w:p>
-    <w:p>
-      <w:pPr>
-        <w:ind w:left="720" w:firstLine="0"/>
-        <w:rPr/>
-      </w:pPr>
-      <w:r>
-        <w:rPr>
-          <w:rtl w:val="0"/>
-        </w:rPr>
-      </w:r>
-    </w:p>
-    <w:p>
-      <w:pPr>
-        <w:ind w:left="720" w:firstLine="0"/>
-        <w:rPr/>
-      </w:pPr>
-      <w:r>
-        <w:rPr>
-          <w:rtl w:val="0"/>
-        </w:rPr>
-        <w:t xml:space="preserve">d) proveedor y cliente: (enviar y recibir mensajes, lo pide la letra) </w:t>
+        <w:t xml:space="preserve">a) proveedor: Nombre completo, </w:t>
+      </w:r>
+      <w:commentRangeStart w:id="0"/>
+      <w:r>
+        <w:rPr>
+          <w:rtl w:val="0"/>
+        </w:rPr>
+        <w:t xml:space="preserve">certificación o aval de conocimientos</w:t>
+      </w:r>
+      <w:commentRangeEnd w:id="0"/>
+      <w:r>
+        <w:commentReference w:id="0"/>
+      </w:r>
+      <w:r>
+        <w:rPr>
+          <w:rtl w:val="0"/>
+        </w:rPr>
+        <w:t xml:space="preserve">, foto de perfil, descripción tanto personal como de habilidades, zona en la que realizará el servicio, dirección personal, teléfono y mail.</w:t>
+      </w:r>
+    </w:p>
+    <w:p>
+      <w:pPr>
+        <w:ind w:left="720" w:firstLine="0"/>
+        <w:rPr/>
+      </w:pPr>
+      <w:r>
+        <w:rPr>
+          <w:rtl w:val="0"/>
+        </w:rPr>
+        <w:t xml:space="preserve">  </w:t>
+      </w:r>
+    </w:p>
+    <w:p>
+      <w:pPr>
+        <w:ind w:left="720" w:firstLine="0"/>
+        <w:rPr/>
+      </w:pPr>
+      <w:r>
+        <w:rPr>
+          <w:rtl w:val="0"/>
+        </w:rPr>
+        <w:t xml:space="preserve">b) clientes:  nombre, apellido, correo,CI, nacimiento, dirección, foto de perfil, correo y teléfono.</w:t>
+      </w:r>
+    </w:p>
+    <w:p>
+      <w:pPr>
+        <w:ind w:left="720" w:firstLine="0"/>
+        <w:rPr/>
+      </w:pPr>
+      <w:r>
+        <w:rPr>
+          <w:rtl w:val="0"/>
+        </w:rPr>
+      </w:r>
+    </w:p>
+    <w:p>
+      <w:pPr>
+        <w:ind w:left="720" w:firstLine="0"/>
+        <w:rPr/>
+      </w:pPr>
+      <w:r>
+        <w:rPr>
+          <w:rtl w:val="0"/>
+        </w:rPr>
+        <w:t xml:space="preserve">c) CI, fecha de nacimiento, para ser  lo más transparente y confiable….</w:t>
+      </w:r>
+    </w:p>
+    <w:p>
+      <w:pPr>
+        <w:ind w:left="720" w:firstLine="0"/>
+        <w:rPr/>
+      </w:pPr>
+      <w:r>
+        <w:rPr>
+          <w:rtl w:val="0"/>
+        </w:rPr>
+      </w:r>
+    </w:p>
+    <w:p>
+      <w:pPr>
+        <w:ind w:left="720" w:firstLine="0"/>
+        <w:rPr/>
+      </w:pPr>
+      <w:r>
+        <w:rPr>
+          <w:rtl w:val="0"/>
+        </w:rPr>
+        <w:t xml:space="preserve">d) Captcha y claves encriptadas. </w:t>
+      </w:r>
+    </w:p>
+    <w:p>
+      <w:pPr>
+        <w:ind w:left="720" w:firstLine="0"/>
+        <w:rPr/>
+      </w:pPr>
+      <w:r>
+        <w:rPr>
+          <w:rtl w:val="0"/>
+        </w:rPr>
+      </w:r>
+    </w:p>
+    <w:p>
+      <w:pPr>
+        <w:ind w:left="0" w:firstLine="720"/>
+        <w:rPr/>
+      </w:pPr>
+      <w:r>
+        <w:rPr>
+          <w:rtl w:val="0"/>
+        </w:rPr>
+        <w:t xml:space="preserve">e) proveedor y cliente: (enviar y recibir mensajes, lo pide la letra) </w:t>
       </w:r>
     </w:p>
     <w:p>
@@ -1108,19 +1187,19 @@
         <w:rPr>
           <w:rtl w:val="0"/>
         </w:rPr>
-        <w:t xml:space="preserve">-Cancelar un servicio, </w:t>
-      </w:r>
-    </w:p>
-    <w:p>
-      <w:pPr>
-        <w:ind w:left="720" w:firstLine="0"/>
-        <w:rPr/>
-      </w:pPr>
-      <w:r>
-        <w:rPr>
-          <w:rtl w:val="0"/>
-        </w:rPr>
-        <w:t xml:space="preserve">-Reagendar un servicio </w:t>
+        <w:t xml:space="preserve">-Cancelar un servicio, S1 sólo se permitirá cancelar 48 horas antes, luego de pasadas las 48 horas no se le permitirá cancelar. S2  sólo se permitirá cancelar 48 horas antes, luego de pasadas las 48 horas se le aplicará una penalización en la que no podrá coordinar otro servicio en el plazo de 1 semana.</w:t>
+      </w:r>
+    </w:p>
+    <w:p>
+      <w:pPr>
+        <w:ind w:left="720" w:firstLine="0"/>
+        <w:rPr/>
+      </w:pPr>
+      <w:r>
+        <w:rPr>
+          <w:rtl w:val="0"/>
+        </w:rPr>
+        <w:t xml:space="preserve">-Reagendar un servicio, S1 sólo se podrá coordinar con el proveedor por mensajería una nueva fecha para realizar el servicio. </w:t>
       </w:r>
     </w:p>
     <w:p>
@@ -1210,10 +1289,13 @@
     <w:p>
       <w:pPr>
         <w:ind w:left="720" w:firstLine="0"/>
-        <w:rPr/>
-      </w:pPr>
-      <w:r>
-        <w:rPr>
+        <w:rPr>
+          <w:b w:val="1"/>
+        </w:rPr>
+      </w:pPr>
+      <w:r>
+        <w:rPr>
+          <w:b w:val="1"/>
           <w:rtl w:val="0"/>
         </w:rPr>
         <w:t xml:space="preserve">Soporte: </w:t>
@@ -1240,56 +1322,132 @@
         <w:rPr>
           <w:rtl w:val="0"/>
         </w:rPr>
-        <w:t xml:space="preserve">En caso de acoso por parte de un proveedor o cliente, falla del sistema,  </w:t>
-      </w:r>
-    </w:p>
-    <w:p>
-      <w:pPr>
-        <w:ind w:left="720" w:firstLine="0"/>
-        <w:rPr/>
-      </w:pPr>
-      <w:r>
-        <w:rPr>
-          <w:rtl w:val="0"/>
-        </w:rPr>
-      </w:r>
-    </w:p>
-    <w:p>
-      <w:pPr>
-        <w:ind w:left="720" w:firstLine="0"/>
-        <w:rPr/>
-      </w:pPr>
-      <w:r>
-        <w:rPr>
-          <w:rtl w:val="0"/>
-        </w:rPr>
-        <w:t xml:space="preserve">e) Todo</w:t>
-      </w:r>
-    </w:p>
-    <w:p>
-      <w:pPr>
-        <w:ind w:left="720" w:firstLine="0"/>
-        <w:rPr/>
-      </w:pPr>
-      <w:r>
-        <w:rPr>
-          <w:rtl w:val="0"/>
-        </w:rPr>
-      </w:r>
-    </w:p>
-    <w:p>
-      <w:pPr>
-        <w:ind w:left="720" w:firstLine="0"/>
-        <w:rPr>
-          <w:color w:val="ff0000"/>
-        </w:rPr>
-      </w:pPr>
-      <w:r>
-        <w:rPr>
-          <w:rtl w:val="0"/>
-        </w:rPr>
-        <w:t xml:space="preserve">f) imagen,pdf,descripción</w:t>
-      </w:r>
+        <w:t xml:space="preserve">-En caso de acoso por parte de un proveedor o cliente, fallas en el sistema.  </w:t>
+      </w:r>
+    </w:p>
+    <w:p>
+      <w:pPr>
+        <w:ind w:left="720" w:firstLine="0"/>
+        <w:rPr>
+          <w:b w:val="1"/>
+        </w:rPr>
+      </w:pPr>
+      <w:r>
+        <w:rPr>
+          <w:b w:val="1"/>
+          <w:rtl w:val="0"/>
+        </w:rPr>
+        <w:t xml:space="preserve">Gestion:</w:t>
+      </w:r>
+    </w:p>
+    <w:p>
+      <w:pPr>
+        <w:ind w:left="720" w:firstLine="0"/>
+        <w:rPr/>
+      </w:pPr>
+      <w:r>
+        <w:rPr>
+          <w:rtl w:val="0"/>
+        </w:rPr>
+        <w:t xml:space="preserve">-Revisar los logs</w:t>
+      </w:r>
+    </w:p>
+    <w:p>
+      <w:pPr>
+        <w:ind w:left="720" w:firstLine="0"/>
+        <w:rPr/>
+      </w:pPr>
+      <w:r>
+        <w:rPr>
+          <w:rtl w:val="0"/>
+        </w:rPr>
+        <w:t xml:space="preserve">-Revisar títulos académicos/certificaciones de finalización</w:t>
+      </w:r>
+    </w:p>
+    <w:p>
+      <w:pPr>
+        <w:ind w:left="0" w:firstLine="0"/>
+        <w:rPr/>
+      </w:pPr>
+      <w:r>
+        <w:rPr>
+          <w:rtl w:val="0"/>
+        </w:rPr>
+      </w:r>
+    </w:p>
+    <w:p>
+      <w:pPr>
+        <w:ind w:left="720" w:firstLine="0"/>
+        <w:rPr/>
+      </w:pPr>
+      <w:r>
+        <w:rPr>
+          <w:rtl w:val="0"/>
+        </w:rPr>
+        <w:t xml:space="preserve">g) Todo</w:t>
+      </w:r>
+    </w:p>
+    <w:p>
+      <w:pPr>
+        <w:ind w:left="720" w:firstLine="0"/>
+        <w:rPr/>
+      </w:pPr>
+      <w:r>
+        <w:rPr>
+          <w:rtl w:val="0"/>
+        </w:rPr>
+      </w:r>
+    </w:p>
+    <w:p>
+      <w:pPr>
+        <w:ind w:left="720" w:firstLine="0"/>
+        <w:rPr/>
+      </w:pPr>
+      <w:r>
+        <w:rPr>
+          <w:rtl w:val="0"/>
+        </w:rPr>
+        <w:t xml:space="preserve">h) imagen,pdf,descripción</w:t>
+      </w:r>
+    </w:p>
+    <w:p>
+      <w:pPr>
+        <w:ind w:left="720" w:firstLine="0"/>
+        <w:rPr/>
+      </w:pPr>
+      <w:r>
+        <w:rPr>
+          <w:rtl w:val="0"/>
+        </w:rPr>
+      </w:r>
+    </w:p>
+    <w:p>
+      <w:pPr>
+        <w:ind w:left="720" w:firstLine="0"/>
+        <w:rPr/>
+      </w:pPr>
+      <w:r>
+        <w:rPr>
+          <w:rtl w:val="0"/>
+        </w:rPr>
+      </w:r>
+    </w:p>
+    <w:p>
+      <w:pPr>
+        <w:ind w:left="720" w:firstLine="0"/>
+        <w:rPr/>
+      </w:pPr>
+      <w:r>
+        <w:rPr>
+          <w:rtl w:val="0"/>
+        </w:rPr>
+      </w:r>
+    </w:p>
+    <w:p>
+      <w:pPr>
+        <w:ind w:left="720" w:firstLine="0"/>
+        <w:rPr/>
+      </w:pPr>
       <w:r>
         <w:rPr>
           <w:rtl w:val="0"/>
@@ -1597,6 +1755,81 @@
         <w:rPr>
           <w:rtl w:val="0"/>
         </w:rPr>
+        <w:t xml:space="preserve">No, solo texto</w:t>
+      </w:r>
+    </w:p>
+    <w:p>
+      <w:pPr>
+        <w:numPr>
+          <w:ilvl w:val="0"/>
+          <w:numId w:val="1"/>
+        </w:numPr>
+        <w:ind w:left="1440" w:hanging="360"/>
+        <w:rPr>
+          <w:u w:val="none"/>
+        </w:rPr>
+      </w:pPr>
+      <w:r>
+        <w:rPr>
+          <w:rtl w:val="0"/>
+        </w:rPr>
+        <w:t xml:space="preserve">Tipo “bandeja entrada”</w:t>
+      </w:r>
+    </w:p>
+    <w:p>
+      <w:pPr>
+        <w:numPr>
+          <w:ilvl w:val="0"/>
+          <w:numId w:val="1"/>
+        </w:numPr>
+        <w:ind w:left="1440" w:hanging="360"/>
+        <w:rPr>
+          <w:u w:val="none"/>
+        </w:rPr>
+      </w:pPr>
+      <w:r>
+        <w:rPr>
+          <w:rtl w:val="0"/>
+        </w:rPr>
+        <w:t xml:space="preserve">Solo en la plataforma</w:t>
+      </w:r>
+    </w:p>
+    <w:p>
+      <w:pPr>
+        <w:rPr/>
+      </w:pPr>
+      <w:r>
+        <w:rPr>
+          <w:rtl w:val="0"/>
+        </w:rPr>
+      </w:r>
+    </w:p>
+    <w:p>
+      <w:pPr>
+        <w:rPr/>
+      </w:pPr>
+      <w:r>
+        <w:rPr>
+          <w:rtl w:val="0"/>
+        </w:rPr>
+        <w:t xml:space="preserve">            5)     </w:t>
+      </w:r>
+    </w:p>
+    <w:p>
+      <w:pPr>
+        <w:numPr>
+          <w:ilvl w:val="0"/>
+          <w:numId w:val="2"/>
+        </w:numPr>
+        <w:ind w:left="720" w:hanging="360"/>
+        <w:rPr>
+          <w:u w:val="none"/>
+        </w:rPr>
+      </w:pPr>
+      <w:r>
+        <w:rPr>
+          <w:rtl w:val="0"/>
+        </w:rPr>
       </w:r>
     </w:p>
     <w:p>
@@ -1640,13 +1873,69 @@
       </w:r>
     </w:p>
     <w:sectPr>
-      <w:footerReference r:id="rId6" w:type="default"/>
+      <w:footerReference r:id="rId7" w:type="default"/>
       <w:pgSz w:h="16834" w:w="11909" w:orient="portrait"/>
       <w:pgMar w:bottom="1440" w:top="1440" w:left="1417.3228346456694" w:right="1440" w:header="720" w:footer="720"/>
       <w:pgNumType w:start="1"/>
     </w:sectPr>
   </w:body>
 </w:document>
+</file>
+
+<file path=word/comments.xml><?xml version="1.0" encoding="utf-8"?>
+<w:comments xmlns:mc="http://schemas.openxmlformats.org/markup-compatibility/2006" xmlns:o="urn:schemas-microsoft-com:office:office" xmlns:r="http://schemas.openxmlformats.org/officeDocument/2006/relationships" xmlns:m="http://schemas.openxmlformats.org/officeDocument/2006/math" xmlns:v="urn:schemas-microsoft-com:vml" xmlns:wp="http://schemas.openxmlformats.org/drawingml/2006/wordprocessingDrawing" xmlns:w10="urn:schemas-microsoft-com:office:word" xmlns:w="http://schemas.openxmlformats.org/wordprocessingml/2006/main" xmlns:wne="http://schemas.microsoft.com/office/word/2006/wordml" xmlns:sl="http://schemas.openxmlformats.org/schemaLibrary/2006/main" xmlns:a="http://schemas.openxmlformats.org/drawingml/2006/main" xmlns:pic="http://schemas.openxmlformats.org/drawingml/2006/picture" xmlns:c="http://schemas.openxmlformats.org/drawingml/2006/chart" xmlns:lc="http://schemas.openxmlformats.org/drawingml/2006/lockedCanvas" xmlns:dgm="http://schemas.openxmlformats.org/drawingml/2006/diagram" xmlns:wps="http://schemas.microsoft.com/office/word/2010/wordprocessingShape" xmlns:wpg="http://schemas.microsoft.com/office/word/2010/wordprocessingGroup" xmlns:w14="http://schemas.microsoft.com/office/word/2010/wordml" xmlns:w15="http://schemas.microsoft.com/office/word/2012/wordml" xmlns:w16="http://schemas.microsoft.com/office/word/2018/wordml" xmlns:w16cex="http://schemas.microsoft.com/office/word/2018/wordml/cex" xmlns:w16cid="http://schemas.microsoft.com/office/word/2016/wordml/cid" xmlns="http://schemas.microsoft.com/office/tasks/2019/documenttasks" xmlns:cr="http://schemas.microsoft.com/office/comments/2020/reactions">
+  <w:comment w:author="Lzz Flores" w:id="0" w:date="2025-06-22T22:14:02Z">
+    <w:p>
+      <w:pPr>
+        <w:keepNext w:val="0"/>
+        <w:keepLines w:val="0"/>
+        <w:pageBreakBefore w:val="0"/>
+        <w:widowControl w:val="0"/>
+        <w:pBdr>
+          <w:top w:space="0" w:sz="0" w:val="nil"/>
+          <w:left w:space="0" w:sz="0" w:val="nil"/>
+          <w:bottom w:space="0" w:sz="0" w:val="nil"/>
+          <w:right w:space="0" w:sz="0" w:val="nil"/>
+          <w:between w:space="0" w:sz="0" w:val="nil"/>
+        </w:pBdr>
+        <w:shd w:fill="auto" w:val="clear"/>
+        <w:spacing w:after="0" w:before="0" w:line="240" w:lineRule="auto"/>
+        <w:ind w:left="0" w:right="0" w:firstLine="0"/>
+        <w:jc w:val="left"/>
+        <w:rPr>
+          <w:rFonts w:ascii="Arial" w:cs="Arial" w:eastAsia="Arial" w:hAnsi="Arial"/>
+          <w:b w:val="0"/>
+          <w:i w:val="0"/>
+          <w:smallCaps w:val="0"/>
+          <w:strike w:val="0"/>
+          <w:color w:val="000000"/>
+          <w:sz w:val="22"/>
+          <w:szCs w:val="22"/>
+          <w:u w:val="none"/>
+          <w:shd w:fill="auto" w:val="clear"/>
+          <w:vertAlign w:val="baseline"/>
+        </w:rPr>
+      </w:pPr>
+      <w:r>
+        <w:rPr>
+          <w:rFonts w:ascii="Arial" w:cs="Arial" w:eastAsia="Arial" w:hAnsi="Arial"/>
+          <w:b w:val="0"/>
+          <w:i w:val="0"/>
+          <w:smallCaps w:val="0"/>
+          <w:strike w:val="0"/>
+          <w:color w:val="000000"/>
+          <w:sz w:val="22"/>
+          <w:szCs w:val="22"/>
+          <w:u w:val="none"/>
+          <w:shd w:fill="auto" w:val="clear"/>
+          <w:vertAlign w:val="baseline"/>
+          <w:rtl w:val="0"/>
+        </w:rPr>
+        <w:t xml:space="preserve">en MER o base de datos  el nombre de este atributo es "título"</w:t>
+      </w:r>
+    </w:p>
+  </w:comment>
+</w:comments>
 </file>
 
 <file path=word/footer1.xml><?xml version="1.0" encoding="utf-8"?>
@@ -1776,8 +2065,121 @@
       </w:rPr>
     </w:lvl>
   </w:abstractNum>
+  <w:abstractNum w:abstractNumId="2">
+    <w:lvl w:ilvl="0">
+      <w:start w:val="1"/>
+      <w:numFmt w:val="lowerLetter"/>
+      <w:lvlText w:val="%1)"/>
+      <w:lvlJc w:val="left"/>
+      <w:pPr>
+        <w:ind w:left="720" w:hanging="360"/>
+      </w:pPr>
+      <w:rPr>
+        <w:u w:val="none"/>
+      </w:rPr>
+    </w:lvl>
+    <w:lvl w:ilvl="1">
+      <w:start w:val="1"/>
+      <w:numFmt w:val="lowerRoman"/>
+      <w:lvlText w:val="%2)"/>
+      <w:lvlJc w:val="right"/>
+      <w:pPr>
+        <w:ind w:left="1440" w:hanging="360"/>
+      </w:pPr>
+      <w:rPr>
+        <w:u w:val="none"/>
+      </w:rPr>
+    </w:lvl>
+    <w:lvl w:ilvl="2">
+      <w:start w:val="1"/>
+      <w:numFmt w:val="decimal"/>
+      <w:lvlText w:val="%3)"/>
+      <w:lvlJc w:val="left"/>
+      <w:pPr>
+        <w:ind w:left="2160" w:hanging="360"/>
+      </w:pPr>
+      <w:rPr>
+        <w:u w:val="none"/>
+      </w:rPr>
+    </w:lvl>
+    <w:lvl w:ilvl="3">
+      <w:start w:val="1"/>
+      <w:numFmt w:val="lowerLetter"/>
+      <w:lvlText w:val="(%4)"/>
+      <w:lvlJc w:val="left"/>
+      <w:pPr>
+        <w:ind w:left="2880" w:hanging="360"/>
+      </w:pPr>
+      <w:rPr>
+        <w:u w:val="none"/>
+      </w:rPr>
+    </w:lvl>
+    <w:lvl w:ilvl="4">
+      <w:start w:val="1"/>
+      <w:numFmt w:val="lowerRoman"/>
+      <w:lvlText w:val="(%5)"/>
+      <w:lvlJc w:val="right"/>
+      <w:pPr>
+        <w:ind w:left="3600" w:hanging="360"/>
+      </w:pPr>
+      <w:rPr>
+        <w:u w:val="none"/>
+      </w:rPr>
+    </w:lvl>
+    <w:lvl w:ilvl="5">
+      <w:start w:val="1"/>
+      <w:numFmt w:val="decimal"/>
+      <w:lvlText w:val="(%6)"/>
+      <w:lvlJc w:val="left"/>
+      <w:pPr>
+        <w:ind w:left="4320" w:hanging="360"/>
+      </w:pPr>
+      <w:rPr>
+        <w:u w:val="none"/>
+      </w:rPr>
+    </w:lvl>
+    <w:lvl w:ilvl="6">
+      <w:start w:val="1"/>
+      <w:numFmt w:val="lowerLetter"/>
+      <w:lvlText w:val="%7."/>
+      <w:lvlJc w:val="left"/>
+      <w:pPr>
+        <w:ind w:left="5040" w:hanging="360"/>
+      </w:pPr>
+      <w:rPr>
+        <w:u w:val="none"/>
+      </w:rPr>
+    </w:lvl>
+    <w:lvl w:ilvl="7">
+      <w:start w:val="1"/>
+      <w:numFmt w:val="lowerRoman"/>
+      <w:lvlText w:val="%8."/>
+      <w:lvlJc w:val="right"/>
+      <w:pPr>
+        <w:ind w:left="5760" w:hanging="360"/>
+      </w:pPr>
+      <w:rPr>
+        <w:u w:val="none"/>
+      </w:rPr>
+    </w:lvl>
+    <w:lvl w:ilvl="8">
+      <w:start w:val="1"/>
+      <w:numFmt w:val="decimal"/>
+      <w:lvlText w:val="%9."/>
+      <w:lvlJc w:val="left"/>
+      <w:pPr>
+        <w:ind w:left="6480" w:hanging="360"/>
+      </w:pPr>
+      <w:rPr>
+        <w:u w:val="none"/>
+      </w:rPr>
+    </w:lvl>
+  </w:abstractNum>
   <w:num w:numId="1">
     <w:abstractNumId w:val="1"/>
+  </w:num>
+  <w:num w:numId="2">
+    <w:abstractNumId w:val="2"/>
   </w:num>
 </w:numbering>
 </file>

</xml_diff>